<commit_message>
docs(tours): update current tour program
</commit_message>
<xml_diff>
--- a/tours/programma_tura_измененный_актуальный.docx
+++ b/tours/programma_tura_измененный_актуальный.docx
@@ -3900,6 +3900,437 @@
       <w:r>
         <w:rPr/>
         <w:t xml:space="preserve"> </w:t>
+      </w:r>
+    </w:p>
+    <w:p xmlns:wp14="http://schemas.microsoft.com/office/word/2010/wordml" xmlns:w="http://schemas.openxmlformats.org/wordprocessingml/2006/main" xmlns:w14="http://schemas.microsoft.com/office/word/2010/wordml">
+      <w:r>
+        <w:br w:type="page"/>
+      </w:r>
+    </w:p>
+    <w:p xmlns:wp14="http://schemas.microsoft.com/office/word/2010/wordml" xmlns:w="http://schemas.openxmlformats.org/wordprocessingml/2006/main" xmlns:w14="http://schemas.microsoft.com/office/word/2010/wordml">
+      <w:pPr>
+        <w:pStyle w:val="Heading1"/>
+      </w:pPr>
+      <w:r>
+        <w:rPr>
+          <w:b w:val="1"/>
+          <w:bCs w:val="1"/>
+        </w:rPr>
+        <w:t>Магия Нормандии</w:t>
+      </w:r>
+    </w:p>
+    <w:p xmlns:wp14="http://schemas.microsoft.com/office/word/2010/wordml" xmlns:w="http://schemas.openxmlformats.org/wordprocessingml/2006/main" xmlns:w14="http://schemas.microsoft.com/office/word/2010/wordml">
+      <w:pPr>
+        <w:spacing w:after="20" w:line="240" w:lineRule="auto"/>
+      </w:pPr>
+      <w:r>
+        <w:t>Виза - НУЖНА</w:t>
+      </w:r>
+    </w:p>
+    <w:p xmlns:wp14="http://schemas.microsoft.com/office/word/2010/wordml" xmlns:w="http://schemas.openxmlformats.org/wordprocessingml/2006/main" xmlns:w14="http://schemas.microsoft.com/office/word/2010/wordml">
+      <w:pPr>
+        <w:spacing w:after="20" w:line="240" w:lineRule="auto"/>
+      </w:pPr>
+      <w:r>
+        <w:t>Куда: Минск - Берлин - Гент - Брюссель* - Этрета* + Онфлёр* + Довиль/Трувиль* - Мон-Сен-Мишель* + Сен-Мало* - Руан - Брюгге - Кёльн - Минск</w:t>
+      </w:r>
+    </w:p>
+    <w:p xmlns:wp14="http://schemas.microsoft.com/office/word/2010/wordml" xmlns:w="http://schemas.openxmlformats.org/wordprocessingml/2006/main" xmlns:w14="http://schemas.microsoft.com/office/word/2010/wordml">
+      <w:pPr>
+        <w:spacing w:after="20" w:line="240" w:lineRule="auto"/>
+      </w:pPr>
+      <w:r>
+        <w:t>Когда: 22.08.2026 - 30.08.2026 (2 места для туристов с визами)</w:t>
+      </w:r>
+    </w:p>
+    <w:p xmlns:wp14="http://schemas.microsoft.com/office/word/2010/wordml" xmlns:w="http://schemas.openxmlformats.org/wordprocessingml/2006/main" xmlns:w14="http://schemas.microsoft.com/office/word/2010/wordml">
+      <w:pPr>
+        <w:spacing w:after="20" w:line="240" w:lineRule="auto"/>
+      </w:pPr>
+      <w:r>
+        <w:t>22.05.2027 - 30.05.2027</w:t>
+      </w:r>
+    </w:p>
+    <w:p xmlns:wp14="http://schemas.microsoft.com/office/word/2010/wordml" xmlns:w="http://schemas.openxmlformats.org/wordprocessingml/2006/main" xmlns:w14="http://schemas.microsoft.com/office/word/2010/wordml">
+      <w:pPr>
+        <w:spacing w:after="20" w:line="240" w:lineRule="auto"/>
+      </w:pPr>
+      <w:r>
+        <w:t>19.06.2027 - 27.06.2027</w:t>
+      </w:r>
+    </w:p>
+    <w:p xmlns:wp14="http://schemas.microsoft.com/office/word/2010/wordml" xmlns:w="http://schemas.openxmlformats.org/wordprocessingml/2006/main" xmlns:w14="http://schemas.microsoft.com/office/word/2010/wordml">
+      <w:pPr>
+        <w:spacing w:after="20" w:line="240" w:lineRule="auto"/>
+      </w:pPr>
+      <w:r>
+        <w:t>24.07.2027 - 01.08.2027</w:t>
+      </w:r>
+    </w:p>
+    <w:p xmlns:wp14="http://schemas.microsoft.com/office/word/2010/wordml" xmlns:w="http://schemas.openxmlformats.org/wordprocessingml/2006/main" xmlns:w14="http://schemas.microsoft.com/office/word/2010/wordml">
+      <w:pPr>
+        <w:spacing w:after="20" w:line="240" w:lineRule="auto"/>
+      </w:pPr>
+      <w:r>
+        <w:t>14.08.2027 - 22.08.2027</w:t>
+      </w:r>
+    </w:p>
+    <w:p xmlns:wp14="http://schemas.microsoft.com/office/word/2010/wordml" xmlns:w="http://schemas.openxmlformats.org/wordprocessingml/2006/main" xmlns:w14="http://schemas.microsoft.com/office/word/2010/wordml">
+      <w:pPr>
+        <w:spacing w:after="20" w:line="240" w:lineRule="auto"/>
+      </w:pPr>
+      <w:r>
+        <w:t>Сколько стоит: 630 € на человека при проживании в 2 или 3 местном номере</w:t>
+      </w:r>
+    </w:p>
+    <w:p xmlns:wp14="http://schemas.microsoft.com/office/word/2010/wordml" xmlns:w="http://schemas.openxmlformats.org/wordprocessingml/2006/main" xmlns:w14="http://schemas.microsoft.com/office/word/2010/wordml">
+      <w:pPr>
+        <w:spacing w:after="20" w:line="240" w:lineRule="auto"/>
+      </w:pPr>
+      <w:r>
+        <w:t>Что включено в стоимость тура:</w:t>
+      </w:r>
+    </w:p>
+    <w:p xmlns:wp14="http://schemas.microsoft.com/office/word/2010/wordml" xmlns:w="http://schemas.openxmlformats.org/wordprocessingml/2006/main" xmlns:w14="http://schemas.microsoft.com/office/word/2010/wordml">
+      <w:pPr>
+        <w:spacing w:after="20" w:line="240" w:lineRule="auto"/>
+      </w:pPr>
+      <w:r>
+        <w:t>туруслуга</w:t>
+      </w:r>
+    </w:p>
+    <w:p xmlns:wp14="http://schemas.microsoft.com/office/word/2010/wordml" xmlns:w="http://schemas.openxmlformats.org/wordprocessingml/2006/main" xmlns:w14="http://schemas.microsoft.com/office/word/2010/wordml">
+      <w:pPr>
+        <w:spacing w:after="20" w:line="240" w:lineRule="auto"/>
+      </w:pPr>
+      <w:r>
+        <w:t>проезд автобусом</w:t>
+      </w:r>
+    </w:p>
+    <w:p xmlns:wp14="http://schemas.microsoft.com/office/word/2010/wordml" xmlns:w="http://schemas.openxmlformats.org/wordprocessingml/2006/main" xmlns:w14="http://schemas.microsoft.com/office/word/2010/wordml">
+      <w:pPr>
+        <w:spacing w:after="20" w:line="240" w:lineRule="auto"/>
+      </w:pPr>
+      <w:r>
+        <w:t>7 ночлегов в отелях</w:t>
+      </w:r>
+    </w:p>
+    <w:p xmlns:wp14="http://schemas.microsoft.com/office/word/2010/wordml" xmlns:w="http://schemas.openxmlformats.org/wordprocessingml/2006/main" xmlns:w14="http://schemas.microsoft.com/office/word/2010/wordml">
+      <w:pPr>
+        <w:spacing w:after="20" w:line="240" w:lineRule="auto"/>
+      </w:pPr>
+      <w:r>
+        <w:t>7 завтраков в отелях</w:t>
+      </w:r>
+    </w:p>
+    <w:p xmlns:wp14="http://schemas.microsoft.com/office/word/2010/wordml" xmlns:w="http://schemas.openxmlformats.org/wordprocessingml/2006/main" xmlns:w14="http://schemas.microsoft.com/office/word/2010/wordml">
+      <w:pPr>
+        <w:spacing w:after="20" w:line="240" w:lineRule="auto"/>
+      </w:pPr>
+      <w:r>
+        <w:t>услуги сопровождающего</w:t>
+      </w:r>
+    </w:p>
+    <w:p xmlns:wp14="http://schemas.microsoft.com/office/word/2010/wordml" xmlns:w="http://schemas.openxmlformats.org/wordprocessingml/2006/main" xmlns:w14="http://schemas.microsoft.com/office/word/2010/wordml">
+      <w:pPr>
+        <w:spacing w:after="20" w:line="240" w:lineRule="auto"/>
+      </w:pPr>
+      <w:r>
+        <w:t>обзорные экскурсии в Берлине, Генте, Руане, Брюгге, Кёльне</w:t>
+      </w:r>
+    </w:p>
+    <w:p xmlns:wp14="http://schemas.microsoft.com/office/word/2010/wordml" xmlns:w="http://schemas.openxmlformats.org/wordprocessingml/2006/main" xmlns:w14="http://schemas.microsoft.com/office/word/2010/wordml">
+      <w:pPr>
+        <w:spacing w:after="20" w:line="240" w:lineRule="auto"/>
+      </w:pPr>
+      <w:r>
+        <w:t>городские налоги</w:t>
+      </w:r>
+    </w:p>
+    <w:p xmlns:wp14="http://schemas.microsoft.com/office/word/2010/wordml" xmlns:w="http://schemas.openxmlformats.org/wordprocessingml/2006/main" xmlns:w14="http://schemas.microsoft.com/office/word/2010/wordml">
+      <w:pPr>
+        <w:spacing w:after="20" w:line="240" w:lineRule="auto"/>
+      </w:pPr>
+      <w:r>
+        <w:t>Что оплачивается дополнительно:</w:t>
+      </w:r>
+    </w:p>
+    <w:p xmlns:wp14="http://schemas.microsoft.com/office/word/2010/wordml" xmlns:w="http://schemas.openxmlformats.org/wordprocessingml/2006/main" xmlns:w14="http://schemas.microsoft.com/office/word/2010/wordml">
+      <w:pPr>
+        <w:spacing w:after="20" w:line="240" w:lineRule="auto"/>
+      </w:pPr>
+      <w:r>
+        <w:t>Обязательно:</w:t>
+      </w:r>
+    </w:p>
+    <w:p xmlns:wp14="http://schemas.microsoft.com/office/word/2010/wordml" xmlns:w="http://schemas.openxmlformats.org/wordprocessingml/2006/main" xmlns:w14="http://schemas.microsoft.com/office/word/2010/wordml">
+      <w:pPr>
+        <w:spacing w:after="20" w:line="240" w:lineRule="auto"/>
+      </w:pPr>
+      <w:r>
+        <w:t>медицинская страховка (оформляется самостоятельно)</w:t>
+      </w:r>
+    </w:p>
+    <w:p xmlns:wp14="http://schemas.microsoft.com/office/word/2010/wordml" xmlns:w="http://schemas.openxmlformats.org/wordprocessingml/2006/main" xmlns:w14="http://schemas.microsoft.com/office/word/2010/wordml">
+      <w:pPr>
+        <w:spacing w:after="20" w:line="240" w:lineRule="auto"/>
+      </w:pPr>
+      <w:r>
+        <w:t>При необходимости:</w:t>
+      </w:r>
+    </w:p>
+    <w:p xmlns:wp14="http://schemas.microsoft.com/office/word/2010/wordml" xmlns:w="http://schemas.openxmlformats.org/wordprocessingml/2006/main" xmlns:w14="http://schemas.microsoft.com/office/word/2010/wordml">
+      <w:pPr>
+        <w:spacing w:after="20" w:line="240" w:lineRule="auto"/>
+      </w:pPr>
+      <w:r>
+        <w:t>консульский сбор за открытие визы - 35 €</w:t>
+      </w:r>
+    </w:p>
+    <w:p xmlns:wp14="http://schemas.microsoft.com/office/word/2010/wordml" xmlns:w="http://schemas.openxmlformats.org/wordprocessingml/2006/main" xmlns:w14="http://schemas.microsoft.com/office/word/2010/wordml">
+      <w:pPr>
+        <w:spacing w:after="20" w:line="240" w:lineRule="auto"/>
+      </w:pPr>
+      <w:r>
+        <w:t>оплата ускоренного продвижения ко въезду на КПП при скоплении большого количества автобусов накануне выезда - 20 €</w:t>
+      </w:r>
+    </w:p>
+    <w:p xmlns:wp14="http://schemas.microsoft.com/office/word/2010/wordml" xmlns:w="http://schemas.openxmlformats.org/wordprocessingml/2006/main" xmlns:w14="http://schemas.microsoft.com/office/word/2010/wordml">
+      <w:pPr>
+        <w:spacing w:after="20" w:line="240" w:lineRule="auto"/>
+      </w:pPr>
+      <w:r>
+        <w:t>По желанию (*):</w:t>
+      </w:r>
+    </w:p>
+    <w:p xmlns:wp14="http://schemas.microsoft.com/office/word/2010/wordml" xmlns:w="http://schemas.openxmlformats.org/wordprocessingml/2006/main" xmlns:w14="http://schemas.microsoft.com/office/word/2010/wordml">
+      <w:pPr>
+        <w:spacing w:after="20" w:line="240" w:lineRule="auto"/>
+      </w:pPr>
+      <w:r>
+        <w:t>обзорная экскурсия по Познани (при благоприятном прохождении границы) - 10 €/ 5 € (несовершеннолетние)</w:t>
+      </w:r>
+    </w:p>
+    <w:p xmlns:wp14="http://schemas.microsoft.com/office/word/2010/wordml" xmlns:w="http://schemas.openxmlformats.org/wordprocessingml/2006/main" xmlns:w14="http://schemas.microsoft.com/office/word/2010/wordml">
+      <w:pPr>
+        <w:spacing w:after="20" w:line="240" w:lineRule="auto"/>
+      </w:pPr>
+      <w:r>
+        <w:t>экскурсия в Брюссель - 25 €</w:t>
+      </w:r>
+    </w:p>
+    <w:p xmlns:wp14="http://schemas.microsoft.com/office/word/2010/wordml" xmlns:w="http://schemas.openxmlformats.org/wordprocessingml/2006/main" xmlns:w14="http://schemas.microsoft.com/office/word/2010/wordml">
+      <w:pPr>
+        <w:spacing w:after="20" w:line="240" w:lineRule="auto"/>
+      </w:pPr>
+      <w:r>
+        <w:t>экскурсия Этрета + Онфлёр + Довиль/Трувиль - 50 € (билет в сады Этрета приобретается самостоятельно)</w:t>
+      </w:r>
+    </w:p>
+    <w:p xmlns:wp14="http://schemas.microsoft.com/office/word/2010/wordml" xmlns:w="http://schemas.openxmlformats.org/wordprocessingml/2006/main" xmlns:w14="http://schemas.microsoft.com/office/word/2010/wordml">
+      <w:pPr>
+        <w:spacing w:after="20" w:line="240" w:lineRule="auto"/>
+      </w:pPr>
+      <w:r>
+        <w:t>экскурсия Мон-Сен-Мишель + Сен-Мало - 50 €</w:t>
+      </w:r>
+    </w:p>
+    <w:p xmlns:wp14="http://schemas.microsoft.com/office/word/2010/wordml" xmlns:w="http://schemas.openxmlformats.org/wordprocessingml/2006/main" xmlns:w14="http://schemas.microsoft.com/office/word/2010/wordml">
+      <w:pPr>
+        <w:spacing w:after="20" w:line="240" w:lineRule="auto"/>
+      </w:pPr>
+      <w:r>
+        <w:t>аренда наушников для экскурсий - 10 €</w:t>
+      </w:r>
+    </w:p>
+    <w:p xmlns:wp14="http://schemas.microsoft.com/office/word/2010/wordml" xmlns:w="http://schemas.openxmlformats.org/wordprocessingml/2006/main" xmlns:w14="http://schemas.microsoft.com/office/word/2010/wordml">
+      <w:pPr>
+        <w:spacing w:after="20" w:line="240" w:lineRule="auto"/>
+      </w:pPr>
+      <w:r>
+        <w:t>Выездные экскурсии состоятся при минимальной группе 25 чел.</w:t>
+      </w:r>
+    </w:p>
+    <w:p xmlns:wp14="http://schemas.microsoft.com/office/word/2010/wordml" xmlns:w="http://schemas.openxmlformats.org/wordprocessingml/2006/main" xmlns:w14="http://schemas.microsoft.com/office/word/2010/wordml">
+      <w:pPr>
+        <w:spacing w:after="20" w:line="240" w:lineRule="auto"/>
+      </w:pPr>
+      <w:r>
+        <w:t>Программа тура:</w:t>
+      </w:r>
+    </w:p>
+    <w:p xmlns:wp14="http://schemas.microsoft.com/office/word/2010/wordml" xmlns:w="http://schemas.openxmlformats.org/wordprocessingml/2006/main" xmlns:w14="http://schemas.microsoft.com/office/word/2010/wordml">
+      <w:pPr>
+        <w:spacing w:after="20" w:line="240" w:lineRule="auto"/>
+      </w:pPr>
+      <w:r>
+        <w:t>1 день, суббота: Выезд из Минска ориентировочно в 15.00. Прохождение границы.</w:t>
+      </w:r>
+    </w:p>
+    <w:p xmlns:wp14="http://schemas.microsoft.com/office/word/2010/wordml" xmlns:w="http://schemas.openxmlformats.org/wordprocessingml/2006/main" xmlns:w14="http://schemas.microsoft.com/office/word/2010/wordml">
+      <w:pPr>
+        <w:spacing w:after="20" w:line="240" w:lineRule="auto"/>
+      </w:pPr>
+      <w:r>
+        <w:t>2 день, воскресенье: Переезд по территории Польши. При благоприятном прохождении границы - факультативная экскурсия по Познани*. Ночлег в транзитном отеле.</w:t>
+      </w:r>
+    </w:p>
+    <w:p xmlns:wp14="http://schemas.microsoft.com/office/word/2010/wordml" xmlns:w="http://schemas.openxmlformats.org/wordprocessingml/2006/main" xmlns:w14="http://schemas.microsoft.com/office/word/2010/wordml">
+      <w:pPr>
+        <w:spacing w:after="20" w:line="240" w:lineRule="auto"/>
+      </w:pPr>
+      <w:r>
+        <w:t>3 день, понедельник: Переезд в Берлин. Обзорная экскурсия. Свободное время. Ночлег в Германии.</w:t>
+      </w:r>
+    </w:p>
+    <w:p xmlns:wp14="http://schemas.microsoft.com/office/word/2010/wordml" xmlns:w="http://schemas.openxmlformats.org/wordprocessingml/2006/main" xmlns:w14="http://schemas.microsoft.com/office/word/2010/wordml">
+      <w:pPr>
+        <w:spacing w:after="20" w:line="240" w:lineRule="auto"/>
+      </w:pPr>
+      <w:r>
+        <w:t>4 день, вторник: Переезд в Гент. Обзорная экскурсия. По желанию - Брюссель*. Ночлег во Франции, в районе Руана.</w:t>
+      </w:r>
+    </w:p>
+    <w:p xmlns:wp14="http://schemas.microsoft.com/office/word/2010/wordml" xmlns:w="http://schemas.openxmlformats.org/wordprocessingml/2006/main" xmlns:w14="http://schemas.microsoft.com/office/word/2010/wordml">
+      <w:pPr>
+        <w:spacing w:after="20" w:line="240" w:lineRule="auto"/>
+      </w:pPr>
+      <w:r>
+        <w:t>5 день, среда: Свободный день в Руане или факультативная поездка в Этрета*, Онфлёр*, Довиль/Трувиль*. Ночлег.</w:t>
+      </w:r>
+    </w:p>
+    <w:p xmlns:wp14="http://schemas.microsoft.com/office/word/2010/wordml" xmlns:w="http://schemas.openxmlformats.org/wordprocessingml/2006/main" xmlns:w14="http://schemas.microsoft.com/office/word/2010/wordml">
+      <w:pPr>
+        <w:spacing w:after="20" w:line="240" w:lineRule="auto"/>
+      </w:pPr>
+      <w:r>
+        <w:t>6 день, четверг: Свободный день в Руане или факультативная поездка в Мон-Сен-Мишель* и Сен-Мало*. Ночлег.</w:t>
+      </w:r>
+    </w:p>
+    <w:p xmlns:wp14="http://schemas.microsoft.com/office/word/2010/wordml" xmlns:w="http://schemas.openxmlformats.org/wordprocessingml/2006/main" xmlns:w14="http://schemas.microsoft.com/office/word/2010/wordml">
+      <w:pPr>
+        <w:spacing w:after="20" w:line="240" w:lineRule="auto"/>
+      </w:pPr>
+      <w:r>
+        <w:t>7 день, пятница: Обзорная экскурсия по Руану. Переезд в Брюгге, обзорная экскурсия. Ночлег в Германии.</w:t>
+      </w:r>
+    </w:p>
+    <w:p xmlns:wp14="http://schemas.microsoft.com/office/word/2010/wordml" xmlns:w="http://schemas.openxmlformats.org/wordprocessingml/2006/main" xmlns:w14="http://schemas.microsoft.com/office/word/2010/wordml">
+      <w:pPr>
+        <w:spacing w:after="20" w:line="240" w:lineRule="auto"/>
+      </w:pPr>
+      <w:r>
+        <w:t>8 день, суббота: Переезд в Кёльн, обзорная экскурсия. Ночлег в Польше.</w:t>
+      </w:r>
+    </w:p>
+    <w:p xmlns:wp14="http://schemas.microsoft.com/office/word/2010/wordml" xmlns:w="http://schemas.openxmlformats.org/wordprocessingml/2006/main" xmlns:w14="http://schemas.microsoft.com/office/word/2010/wordml">
+      <w:pPr>
+        <w:spacing w:after="20" w:line="240" w:lineRule="auto"/>
+      </w:pPr>
+      <w:r>
+        <w:t>9 день, воскресенье / утро понедельника: Выезд в Минск через Брест.</w:t>
+      </w:r>
+    </w:p>
+    <w:p xmlns:wp14="http://schemas.microsoft.com/office/word/2010/wordml" xmlns:w="http://schemas.openxmlformats.org/wordprocessingml/2006/main" xmlns:w14="http://schemas.microsoft.com/office/word/2010/wordml">
+      <w:pPr>
+        <w:spacing w:after="20" w:line="240" w:lineRule="auto"/>
+      </w:pPr>
+      <w:r/>
+    </w:p>
+    <w:p xmlns:w="http://schemas.openxmlformats.org/wordprocessingml/2006/main" xmlns:w14="http://schemas.microsoft.com/office/word/2010/wordml">
+      <w:pPr>
+        <w:pStyle w:val="Normal"/>
+        <w:spacing w:after="20" w:line="240" w:lineRule="auto"/>
+      </w:pPr>
+      <w:r>
+        <w:rPr>
+          <w:lang w:val="fr-FR"/>
+        </w:rPr>
+        <w:t>Ссылка на тур - https://docs.google.com/document/d/1d1hNBDdRZME-yckgo47PDmDAXgKhVQm-w9xIARfpr6w/</w:t>
+      </w:r>
+      <w:r>
+        <w:rPr>
+          <w:lang w:val="fr-FR"/>
+        </w:rPr>
+        <w:t/>
+      </w:r>
+      <w:r>
+        <w:rPr>
+          <w:lang w:val="fr-FR"/>
+        </w:rPr>
+        <w:t/>
+      </w:r>
+      <w:r>
+        <w:rPr>
+          <w:lang w:val="fr-FR"/>
+        </w:rPr>
+        <w:t/>
+      </w:r>
+      <w:r>
+        <w:rPr>
+          <w:lang w:val="fr-FR"/>
+        </w:rPr>
+        <w:t/>
+      </w:r>
+      <w:r>
+        <w:rPr>
+          <w:lang w:val="fr-FR"/>
+        </w:rPr>
+        <w:t/>
+      </w:r>
+      <w:r>
+        <w:rPr>
+          <w:lang w:val="fr-FR"/>
+        </w:rPr>
+        <w:t/>
+      </w:r>
+    </w:p>
+    <w:p xmlns:w="http://schemas.openxmlformats.org/wordprocessingml/2006/main" xmlns:w14="http://schemas.microsoft.com/office/word/2010/wordml">
+      <w:pPr>
+        <w:pStyle w:val="Normal"/>
+        <w:spacing w:after="20" w:line="240" w:lineRule="auto"/>
+      </w:pPr>
+      <w:r>
+        <w:rPr>
+          <w:lang w:val="fr-FR"/>
+        </w:rPr>
+        <w:t>Ссылка на бронирование - https://sundita.by/tur/magiya-normandii/</w:t>
+      </w:r>
+      <w:r>
+        <w:rPr>
+          <w:lang w:val="fr-FR"/>
+        </w:rPr>
+        <w:t/>
+      </w:r>
+      <w:r>
+        <w:rPr>
+          <w:lang w:val="fr-FR"/>
+        </w:rPr>
+        <w:t/>
+      </w:r>
+      <w:r>
+        <w:rPr>
+          <w:lang w:val="fr-FR"/>
+        </w:rPr>
+        <w:t/>
+      </w:r>
+      <w:r>
+        <w:rPr>
+          <w:lang w:val="fr-FR"/>
+        </w:rPr>
+        <w:t/>
+      </w:r>
+      <w:r>
+        <w:rPr>
+          <w:lang w:val="fr-FR"/>
+        </w:rPr>
+        <w:t/>
+      </w:r>
+      <w:r>
+        <w:rPr>
+          <w:lang w:val="fr-FR"/>
+        </w:rPr>
+        <w:t/>
       </w:r>
     </w:p>
     <w:sectPr>

</xml_diff>